<commit_message>
Upgrade solution to super digital employee
</commit_message>
<xml_diff>
--- a/提交材料/01_开题报告.docx
+++ b/提交材料/01_开题报告.docx
@@ -52,7 +52,7 @@
         <w:rPr>
           <w:rFonts w:ascii="Calibri" w:hAnsi="Calibri" w:eastAsia="Microsoft YaHei"/>
         </w:rPr>
-        <w:t>该命题重点考察候选人能否把合成氨现场从“单装置稳产”抽象为“安全、能源、设备、库存、订单、环保共同约束下的经营优化”问题。云图控股应城 70 万吨合成氨项目补齐氮肥原料，与尿浆、复合肥、联碱和液氨外售形成协同链路[3][4][5]。因此，AI 调度专家不应只是聊天机器人或看板，而应在不触碰 DCS/SIS 安全控制底线的前提下，融合 MES、ERP、DCS historian、罐区和设备点检数据，给出班次级可解释排产建议、风险边界、收益测算和复盘依据。难点在于让班长、调度、设备、安环和经营部门使用同一套数据口径做决策。</w:t>
+        <w:t>补充要求说明，云图合成氨装置在硬件层面的单位成本已接近理论最优，下一轮降本空间来自运行管理的软件层。命题真正考察的是能否打造“超级数字员工”：实时挖掘成本偏差，缩短调度指挥链条，沉淀专家知识并自我迭代。云图控股应城 70 万吨合成氨项目补齐氮肥原料，与尿浆、复合肥、联碱和液氨外售形成协同链路[3][4][5]。因此，AI 调度专家不应只是聊天机器人或看板，而应在不触碰 DCS/SIS 安全控制底线的前提下，融合 MES、ERP、DCS historian、罐区和设备点检数据，形成“寻优-指挥-监督-学习”闭环。</w:t>
       </w:r>
     </w:p>
     <w:p>
@@ -68,7 +68,7 @@
         <w:rPr>
           <w:rFonts w:ascii="Calibri" w:hAnsi="Calibri" w:eastAsia="Microsoft YaHei"/>
         </w:rPr>
-        <w:t>方案命名为“合成氨 AI 调控师工作台”。第一阶段不自动控制装置，而是做影子运行、班前会辅助和班后复盘。平台先接入 MES 日计划、ERP 订单与交期、液氨罐区库存、DCS 关键摘要点、设备健康评分和能源价格窗口，形成班次事实表。预测层滚动预测下游需求、库存消耗、能源成本和设备风险；约束层用机理边界和专家规则校验合成塔温升、压缩机负荷、罐区压力、安全库存、负荷升降速率和环保指标；优化层生成稳态、订单冲刺、设备保守三套方案，分别说明负荷、下游分配、库存策略、点检窗口和收益风险；解释层将结果转成班长可读的交接摘要，明确“为什么这样排、触发了哪些边界、不能做什么”。</w:t>
+        <w:t>方案命名为“合成氨 AI 调控师工作台”。第一阶段不自动控制装置，而是做影子运行、班前会辅助和班后复盘。平台先接入 MES 日计划、ERP 订单与交期、液氨罐区库存、DCS 关键摘要点、设备健康评分和能源价格窗口，形成班次事实表。预测层滚动预测下游需求、库存消耗、能源成本和设备风险；约束层用机理边界和专家规则校验合成塔温升、压缩机负荷、罐区压力、安全库存、负荷升降速率和环保指标；寻优层设置成本雷达，拆解能源窗口、库存占用、设备效率、订单切换和操作偏差五类可挖潜因子；优化层生成稳态、订单冲刺、设备保守三套方案，分别说明负荷、下游分配、库存策略、点检窗口和收益风险；指挥层一键生成交接摘要和调度指令，执行监督层自动跟踪负荷偏差、库存变化和订单完成。</w:t>
       </w:r>
     </w:p>
     <w:p>
@@ -76,9 +76,294 @@
         <w:rPr>
           <w:rFonts w:ascii="Calibri" w:hAnsi="Calibri" w:eastAsia="Microsoft YaHei"/>
         </w:rPr>
-        <w:t>落地路线采用 30/60/90 天试点：30 天跑通数据事实表和口径确认，60 天进入影子模式记录采纳/不采纳原因，90 天做小闭环复盘并决定是否扩大范围。验收采用保守口径：高优订单满足率不低于人工排产，且单位氨能耗、库存占用、调度耗时或异常预警至少一项稳定改善；若关键数据延迟超过 15 分钟、模型连续两天偏差超阈值或安环红线接近且无法解释，系统自动降级为人工调度。该方案的创新点不是“让 AI 接管生产”，而是把连续流程装置的现场经验、优化模型和企业经营目标整合成可审计、可复盘、可逐步推广的调度能力。</w:t>
+        <w:t>每次方案会沉淀为知识库：输入状态、推荐方案、审批人、采纳/未采纳原因、实际执行偏差和效果归因。落地路线采用 30/60/90 天试点：30 天跑通数据事实表和口径确认，60 天进入影子模式记录采纳/不采纳原因，90 天做小闭环复盘并决定是否扩大范围。验收采用保守口径：高优订单满足率不低于人工排产，且单位氨能耗、库存占用、调度耗时或异常预警至少一项稳定改善；若关键数据延迟超过 15 分钟、模型连续两天偏差超阈值或安环红线接近且无法解释，系统自动降级为人工调度。该方案的创新点不是“让 AI 接管生产”，而是把连续流程装置的现场经验、优化模型和企业经营目标整合成可审计、可复盘、可逐步自我升级的数字员工。</w:t>
       </w:r>
     </w:p>
+    <w:p>
+      <w:pPr>
+        <w:pStyle w:val="Heading1"/>
+      </w:pPr>
+      <w:r>
+        <w:t>三大挑战与回答</w:t>
+      </w:r>
+    </w:p>
+    <w:tbl>
+      <w:tblPr>
+        <w:tblStyle w:val="TableGrid"/>
+        <w:tblW w:type="auto" w:w="0"/>
+        <w:jc w:val="center"/>
+        <w:tblLayout w:type="fixed"/>
+        <w:tblLook w:firstColumn="1" w:firstRow="1" w:lastColumn="0" w:lastRow="0" w:noHBand="0" w:noVBand="1" w:val="04A0"/>
+      </w:tblPr>
+      <w:tblGrid>
+        <w:gridCol w:w="3216"/>
+        <w:gridCol w:w="3216"/>
+        <w:gridCol w:w="3216"/>
+      </w:tblGrid>
+      <w:tr>
+        <w:tc>
+          <w:tcPr>
+            <w:tcW w:type="dxa" w:w="1728"/>
+            <w:vAlign w:val="center"/>
+            <w:tcMar>
+              <w:top w:w="80" w:type="dxa"/>
+              <w:start w:w="120" w:type="dxa"/>
+              <w:bottom w:w="80" w:type="dxa"/>
+              <w:end w:w="120" w:type="dxa"/>
+            </w:tcMar>
+            <w:shd w:fill="E8EEF5"/>
+          </w:tcPr>
+          <w:p>
+            <w:r>
+              <w:rPr>
+                <w:rFonts w:ascii="Calibri" w:hAnsi="Calibri" w:eastAsia="Microsoft YaHei"/>
+                <w:b/>
+              </w:rPr>
+              <w:t>试题挑战</w:t>
+            </w:r>
+          </w:p>
+        </w:tc>
+        <w:tc>
+          <w:tcPr>
+            <w:tcW w:type="dxa" w:w="3744"/>
+            <w:vAlign w:val="center"/>
+            <w:tcMar>
+              <w:top w:w="80" w:type="dxa"/>
+              <w:start w:w="120" w:type="dxa"/>
+              <w:bottom w:w="80" w:type="dxa"/>
+              <w:end w:w="120" w:type="dxa"/>
+            </w:tcMar>
+            <w:shd w:fill="E8EEF5"/>
+          </w:tcPr>
+          <w:p>
+            <w:r>
+              <w:rPr>
+                <w:rFonts w:ascii="Calibri" w:hAnsi="Calibri" w:eastAsia="Microsoft YaHei"/>
+                <w:b/>
+              </w:rPr>
+              <w:t>方案回答</w:t>
+            </w:r>
+          </w:p>
+        </w:tc>
+        <w:tc>
+          <w:tcPr>
+            <w:tcW w:type="dxa" w:w="3888"/>
+            <w:vAlign w:val="center"/>
+            <w:tcMar>
+              <w:top w:w="80" w:type="dxa"/>
+              <w:start w:w="120" w:type="dxa"/>
+              <w:bottom w:w="80" w:type="dxa"/>
+              <w:end w:w="120" w:type="dxa"/>
+            </w:tcMar>
+            <w:shd w:fill="E8EEF5"/>
+          </w:tcPr>
+          <w:p>
+            <w:r>
+              <w:rPr>
+                <w:rFonts w:ascii="Calibri" w:hAnsi="Calibri" w:eastAsia="Microsoft YaHei"/>
+                <w:b/>
+              </w:rPr>
+              <w:t>企业可见成果</w:t>
+            </w:r>
+          </w:p>
+        </w:tc>
+      </w:tr>
+      <w:tr>
+        <w:tc>
+          <w:tcPr>
+            <w:tcW w:type="dxa" w:w="1728"/>
+            <w:vAlign w:val="center"/>
+            <w:tcMar>
+              <w:top w:w="80" w:type="dxa"/>
+              <w:start w:w="120" w:type="dxa"/>
+              <w:bottom w:w="80" w:type="dxa"/>
+              <w:end w:w="120" w:type="dxa"/>
+            </w:tcMar>
+          </w:tcPr>
+          <w:p>
+            <w:r>
+              <w:rPr>
+                <w:rFonts w:ascii="Calibri" w:hAnsi="Calibri" w:eastAsia="Microsoft YaHei"/>
+                <w:sz w:val="19"/>
+              </w:rPr>
+              <w:t>调度寻优难</w:t>
+            </w:r>
+          </w:p>
+        </w:tc>
+        <w:tc>
+          <w:tcPr>
+            <w:tcW w:type="dxa" w:w="3744"/>
+            <w:vAlign w:val="center"/>
+            <w:tcMar>
+              <w:top w:w="80" w:type="dxa"/>
+              <w:start w:w="120" w:type="dxa"/>
+              <w:bottom w:w="80" w:type="dxa"/>
+              <w:end w:w="120" w:type="dxa"/>
+            </w:tcMar>
+          </w:tcPr>
+          <w:p>
+            <w:r>
+              <w:rPr>
+                <w:rFonts w:ascii="Calibri" w:hAnsi="Calibri" w:eastAsia="Microsoft YaHei"/>
+                <w:sz w:val="19"/>
+              </w:rPr>
+              <w:t>成本寻优雷达 + 三案比选 + 约束孪生</w:t>
+            </w:r>
+          </w:p>
+        </w:tc>
+        <w:tc>
+          <w:tcPr>
+            <w:tcW w:type="dxa" w:w="3888"/>
+            <w:vAlign w:val="center"/>
+            <w:tcMar>
+              <w:top w:w="80" w:type="dxa"/>
+              <w:start w:w="120" w:type="dxa"/>
+              <w:bottom w:w="80" w:type="dxa"/>
+              <w:end w:w="120" w:type="dxa"/>
+            </w:tcMar>
+          </w:tcPr>
+          <w:p>
+            <w:r>
+              <w:rPr>
+                <w:rFonts w:ascii="Calibri" w:hAnsi="Calibri" w:eastAsia="Microsoft YaHei"/>
+                <w:sz w:val="19"/>
+              </w:rPr>
+              <w:t>看到每次降本来自能源、库存、设备、订单还是操作偏差</w:t>
+            </w:r>
+          </w:p>
+        </w:tc>
+      </w:tr>
+      <w:tr>
+        <w:tc>
+          <w:tcPr>
+            <w:tcW w:type="dxa" w:w="1728"/>
+            <w:vAlign w:val="center"/>
+            <w:tcMar>
+              <w:top w:w="80" w:type="dxa"/>
+              <w:start w:w="120" w:type="dxa"/>
+              <w:bottom w:w="80" w:type="dxa"/>
+              <w:end w:w="120" w:type="dxa"/>
+            </w:tcMar>
+          </w:tcPr>
+          <w:p>
+            <w:r>
+              <w:rPr>
+                <w:rFonts w:ascii="Calibri" w:hAnsi="Calibri" w:eastAsia="Microsoft YaHei"/>
+                <w:sz w:val="19"/>
+              </w:rPr>
+              <w:t>指挥效率低</w:t>
+            </w:r>
+          </w:p>
+        </w:tc>
+        <w:tc>
+          <w:tcPr>
+            <w:tcW w:type="dxa" w:w="3744"/>
+            <w:vAlign w:val="center"/>
+            <w:tcMar>
+              <w:top w:w="80" w:type="dxa"/>
+              <w:start w:w="120" w:type="dxa"/>
+              <w:bottom w:w="80" w:type="dxa"/>
+              <w:end w:w="120" w:type="dxa"/>
+            </w:tcMar>
+          </w:tcPr>
+          <w:p>
+            <w:r>
+              <w:rPr>
+                <w:rFonts w:ascii="Calibri" w:hAnsi="Calibri" w:eastAsia="Microsoft YaHei"/>
+                <w:sz w:val="19"/>
+              </w:rPr>
+              <w:t>调控师指令窗口 + 交接摘要 + 执行监督</w:t>
+            </w:r>
+          </w:p>
+        </w:tc>
+        <w:tc>
+          <w:tcPr>
+            <w:tcW w:type="dxa" w:w="3888"/>
+            <w:vAlign w:val="center"/>
+            <w:tcMar>
+              <w:top w:w="80" w:type="dxa"/>
+              <w:start w:w="120" w:type="dxa"/>
+              <w:bottom w:w="80" w:type="dxa"/>
+              <w:end w:w="120" w:type="dxa"/>
+            </w:tcMar>
+          </w:tcPr>
+          <w:p>
+            <w:r>
+              <w:rPr>
+                <w:rFonts w:ascii="Calibri" w:hAnsi="Calibri" w:eastAsia="Microsoft YaHei"/>
+                <w:sz w:val="19"/>
+              </w:rPr>
+              <w:t>缩短班前会准备和跨部门确认时间</w:t>
+            </w:r>
+          </w:p>
+        </w:tc>
+      </w:tr>
+      <w:tr>
+        <w:tc>
+          <w:tcPr>
+            <w:tcW w:type="dxa" w:w="1728"/>
+            <w:vAlign w:val="center"/>
+            <w:tcMar>
+              <w:top w:w="80" w:type="dxa"/>
+              <w:start w:w="120" w:type="dxa"/>
+              <w:bottom w:w="80" w:type="dxa"/>
+              <w:end w:w="120" w:type="dxa"/>
+            </w:tcMar>
+          </w:tcPr>
+          <w:p>
+            <w:r>
+              <w:rPr>
+                <w:rFonts w:ascii="Calibri" w:hAnsi="Calibri" w:eastAsia="Microsoft YaHei"/>
+                <w:sz w:val="19"/>
+              </w:rPr>
+              <w:t>知识传承难</w:t>
+            </w:r>
+          </w:p>
+        </w:tc>
+        <w:tc>
+          <w:tcPr>
+            <w:tcW w:type="dxa" w:w="3744"/>
+            <w:vAlign w:val="center"/>
+            <w:tcMar>
+              <w:top w:w="80" w:type="dxa"/>
+              <w:start w:w="120" w:type="dxa"/>
+              <w:bottom w:w="80" w:type="dxa"/>
+              <w:end w:w="120" w:type="dxa"/>
+            </w:tcMar>
+          </w:tcPr>
+          <w:p>
+            <w:r>
+              <w:rPr>
+                <w:rFonts w:ascii="Calibri" w:hAnsi="Calibri" w:eastAsia="Microsoft YaHei"/>
+                <w:sz w:val="19"/>
+              </w:rPr>
+              <w:t>调度指令库 + 异常处置经验库 + 未采纳标签</w:t>
+            </w:r>
+          </w:p>
+        </w:tc>
+        <w:tc>
+          <w:tcPr>
+            <w:tcW w:type="dxa" w:w="3888"/>
+            <w:vAlign w:val="center"/>
+            <w:tcMar>
+              <w:top w:w="80" w:type="dxa"/>
+              <w:start w:w="120" w:type="dxa"/>
+              <w:bottom w:w="80" w:type="dxa"/>
+              <w:end w:w="120" w:type="dxa"/>
+            </w:tcMar>
+          </w:tcPr>
+          <w:p>
+            <w:r>
+              <w:rPr>
+                <w:rFonts w:ascii="Calibri" w:hAnsi="Calibri" w:eastAsia="Microsoft YaHei"/>
+                <w:sz w:val="19"/>
+              </w:rPr>
+              <w:t>把专家经验变成可检索、可复盘、可迭代的知识资产</w:t>
+            </w:r>
+          </w:p>
+        </w:tc>
+      </w:tr>
+    </w:tbl>
     <w:p>
       <w:pPr>
         <w:pStyle w:val="Heading1"/>
@@ -201,6 +486,22 @@
           <w:rFonts w:ascii="Calibri" w:hAnsi="Calibri" w:eastAsia="Microsoft YaHei"/>
         </w:rPr>
         <w:t>[8] AIChE 2025 Annual Meeting. Scheduling and Control of Green Ammonia Plants. https://aiche.confex.com/aiche/2025/meetingapp.cgi/Paper/710466</w:t>
+      </w:r>
+    </w:p>
+    <w:p>
+      <w:r>
+        <w:rPr>
+          <w:rFonts w:ascii="Calibri" w:hAnsi="Calibri" w:eastAsia="Microsoft YaHei"/>
+        </w:rPr>
+        <w:t>[9] 中国信息通信研究院、华为等. 工业与AI融合应用指南. https://www-file.huawei.com/dam/asset/view/dda7ee674ced41d4bb989b365ea0a028.pdf</w:t>
+      </w:r>
+    </w:p>
+    <w:p>
+      <w:r>
+        <w:rPr>
+          <w:rFonts w:ascii="Calibri" w:hAnsi="Calibri" w:eastAsia="Microsoft YaHei"/>
+        </w:rPr>
+        <w:t>[10] HG/T 6346—2025. 石化和化工行业数字化转型成熟度模型与评估相关资料. https://gxt.gansu.gov.cn/gxt/c126826/202511/174237249/files/99bb56ef71d347248ae58125b2e12aee.pdf</w:t>
       </w:r>
     </w:p>
     <w:sectPr>

</xml_diff>

<commit_message>
Refocus platform on ammonia synthesis operations
</commit_message>
<xml_diff>
--- a/提交材料/01_开题报告.docx
+++ b/提交材料/01_开题报告.docx
@@ -52,7 +52,7 @@
         <w:rPr>
           <w:rFonts w:ascii="Calibri" w:hAnsi="Calibri" w:eastAsia="Microsoft YaHei"/>
         </w:rPr>
-        <w:t>补充要求说明，云图合成氨装置在硬件层面的单位成本已接近理论最优，下一轮降本空间来自运行管理的软件层。命题真正考察的是能否打造“超级数字员工”：实时挖掘成本偏差，缩短调度指挥链条，沉淀专家知识并自我迭代。云图控股应城 70 万吨合成氨项目补齐氮肥原料，与尿浆、复合肥、联碱和液氨外售形成协同链路[3][4][5]。因此，AI 调度专家不应只是聊天机器人或看板，而应在不触碰 DCS/SIS 安全控制底线的前提下，融合 MES、ERP、DCS historian、罐区和设备点检数据，形成“寻优-指挥-监督-学习”闭环。</w:t>
+        <w:t>补充要求说明，云图合成氨装置在硬件层面的单位成本已接近理论最优，下一轮降本空间来自合成氨运行管理的软件层。命题真正考察的是能否打造“合成氨超级数字员工”：围绕氨合成负荷、氢氮比、合成塔床层温升、循环压缩机、液氨库存和下游用氨，实时挖掘成本偏差，缩短调度指挥链条，沉淀专家知识并自我迭代。云图控股应城 70 万吨合成氨项目补齐氮肥原料，与尿浆、复合肥、联碱和液氨外售形成协同链路[3][4][5]。因此，AI 调度专家不应只是聊天机器人或看板，而应在不触碰 DCS/SIS 安全控制底线的前提下，融合 MES、ERP、DCS historian、罐区和设备点检数据，形成“寻优-指挥-监督-学习”闭环。</w:t>
       </w:r>
     </w:p>
     <w:p>
@@ -68,7 +68,7 @@
         <w:rPr>
           <w:rFonts w:ascii="Calibri" w:hAnsi="Calibri" w:eastAsia="Microsoft YaHei"/>
         </w:rPr>
-        <w:t>方案命名为“合成氨 AI 调控师工作台”。第一阶段不自动控制装置，而是做影子运行、班前会辅助和班后复盘。平台先接入 MES 日计划、ERP 订单与交期、液氨罐区库存、DCS 关键摘要点、设备健康评分和能源价格窗口，形成班次事实表。预测层滚动预测下游需求、库存消耗、能源成本和设备风险；约束层用机理边界和专家规则校验合成塔温升、压缩机负荷、罐区压力、安全库存、负荷升降速率和环保指标；寻优层设置成本雷达，拆解能源窗口、库存占用、设备效率、订单切换和操作偏差五类可挖潜因子；优化层生成稳态、订单冲刺、设备保守三套方案，分别说明负荷、下游分配、库存策略、点检窗口和收益风险；指挥层一键生成交接摘要和调度指令，执行监督层自动跟踪负荷偏差、库存变化和订单完成。</w:t>
+        <w:t>方案命名为“合成氨 AI 调控师工作台”。第一阶段不自动控制装置，而是做影子运行、班前会辅助和班后复盘。平台先接入 MES 日计划、ERP 订单与交期、液氨罐区库存、DCS 关键摘要点、设备健康评分和原料/蒸汽电价窗口，形成班次事实表。预测层滚动预测下游用氨、液氨库存消耗、吨氨能源成本和设备风险；约束层用机理边界和专家规则校验氢氮比、合成塔床层温升、循环压缩机负荷、罐区压力、安全库存、负荷升降速率和环保指标；寻优层设置吨氨成本雷达，拆解原料/蒸汽、液氨库存、压缩机效率、合成塔窗口和负荷偏差五类可挖潜因子；优化层生成稳氨、保供、护机三套方案，分别说明合成负荷、下游消纳、库存策略、点检窗口和收益风险；指挥层一键生成交接摘要和调度指令，执行监督层自动跟踪合成负荷偏差、氢氮比偏差、液氨库存变化和订单完成。</w:t>
       </w:r>
     </w:p>
     <w:p>
@@ -76,7 +76,7 @@
         <w:rPr>
           <w:rFonts w:ascii="Calibri" w:hAnsi="Calibri" w:eastAsia="Microsoft YaHei"/>
         </w:rPr>
-        <w:t>每次方案会沉淀为知识库：输入状态、推荐方案、审批人、采纳/未采纳原因、实际执行偏差和效果归因。落地路线采用 30/60/90 天试点：30 天跑通数据事实表和口径确认，60 天进入影子模式记录采纳/不采纳原因，90 天做小闭环复盘并决定是否扩大范围。验收采用保守口径：高优订单满足率不低于人工排产，且单位氨能耗、库存占用、调度耗时或异常预警至少一项稳定改善；若关键数据延迟超过 15 分钟、模型连续两天偏差超阈值或安环红线接近且无法解释，系统自动降级为人工调度。该方案的创新点不是“让 AI 接管生产”，而是把连续流程装置的现场经验、优化模型和企业经营目标整合成可审计、可复盘、可逐步自我升级的数字员工。</w:t>
+        <w:t>每次方案会沉淀为合成氨知识库：输入状态、推荐合成负荷、氢氮比/床层温升约束、审批人、采纳/未采纳原因、实际执行偏差和效果归因。落地路线采用 30/60/90 天试点：30 天跑通数据事实表和口径确认，60 天进入影子模式记录采纳/不采纳原因，90 天做小闭环复盘并决定是否扩大范围。验收采用保守口径：高优下游用氨满足率不低于人工排产，且吨氨能耗、液氨库存占用、调度耗时或异常预警至少一项稳定改善；若关键数据延迟超过 15 分钟、模型连续两天偏差超阈值或安环红线接近且无法解释，系统自动降级为人工调度。该方案的创新点不是“让 AI 接管生产”，而是把合成氨连续流程装置的现场经验、优化模型和企业经营目标整合成可审计、可复盘、可逐步自我升级的数字员工。</w:t>
       </w:r>
     </w:p>
     <w:p>
@@ -207,7 +207,7 @@
                 <w:rFonts w:ascii="Calibri" w:hAnsi="Calibri" w:eastAsia="Microsoft YaHei"/>
                 <w:sz w:val="19"/>
               </w:rPr>
-              <w:t>成本寻优雷达 + 三案比选 + 约束孪生</w:t>
+              <w:t>吨氨成本雷达 + 稳氨/保供/护机三案 + 合成回路约束孪生</w:t>
             </w:r>
           </w:p>
         </w:tc>
@@ -228,7 +228,7 @@
                 <w:rFonts w:ascii="Calibri" w:hAnsi="Calibri" w:eastAsia="Microsoft YaHei"/>
                 <w:sz w:val="19"/>
               </w:rPr>
-              <w:t>看到每次降本来自能源、库存、设备、订单还是操作偏差</w:t>
+              <w:t>看到每次降本来自原料/蒸汽、液氨库存、压缩机、合成塔还是负荷偏差</w:t>
             </w:r>
           </w:p>
         </w:tc>
@@ -272,7 +272,7 @@
                 <w:rFonts w:ascii="Calibri" w:hAnsi="Calibri" w:eastAsia="Microsoft YaHei"/>
                 <w:sz w:val="19"/>
               </w:rPr>
-              <w:t>调控师指令窗口 + 交接摘要 + 执行监督</w:t>
+              <w:t>合成氨调控师指令窗口 + 交接摘要 + 执行监督</w:t>
             </w:r>
           </w:p>
         </w:tc>
@@ -293,7 +293,7 @@
                 <w:rFonts w:ascii="Calibri" w:hAnsi="Calibri" w:eastAsia="Microsoft YaHei"/>
                 <w:sz w:val="19"/>
               </w:rPr>
-              <w:t>缩短班前会准备和跨部门确认时间</w:t>
+              <w:t>缩短班前会准备和合成负荷调整确认时间</w:t>
             </w:r>
           </w:p>
         </w:tc>
@@ -337,7 +337,7 @@
                 <w:rFonts w:ascii="Calibri" w:hAnsi="Calibri" w:eastAsia="Microsoft YaHei"/>
                 <w:sz w:val="19"/>
               </w:rPr>
-              <w:t>调度指令库 + 异常处置经验库 + 未采纳标签</w:t>
+              <w:t>合成负荷指令库 + 氢氮比/床层温升异常库 + 未采纳标签</w:t>
             </w:r>
           </w:p>
         </w:tc>
@@ -358,7 +358,7 @@
                 <w:rFonts w:ascii="Calibri" w:hAnsi="Calibri" w:eastAsia="Microsoft YaHei"/>
                 <w:sz w:val="19"/>
               </w:rPr>
-              <w:t>把专家经验变成可检索、可复盘、可迭代的知识资产</w:t>
+              <w:t>把专家经验变成可检索、可复盘、可迭代的合成氨知识资产</w:t>
             </w:r>
           </w:p>
         </w:tc>

</xml_diff>

<commit_message>
Align submission materials with application requirements
</commit_message>
<xml_diff>
--- a/提交材料/01_开题报告.docx
+++ b/提交材料/01_开题报告.docx
@@ -36,7 +36,7 @@
         <w:pStyle w:val="Heading1"/>
       </w:pPr>
       <w:r>
-        <w:t>可直接提交正文</w:t>
+        <w:t>报名表可直接提交正文</w:t>
       </w:r>
     </w:p>
     <w:p>
@@ -44,7 +44,7 @@
         <w:pStyle w:val="Heading2"/>
       </w:pPr>
       <w:r>
-        <w:t>Part 1：命题前置分析与洞察（约 230 字）</w:t>
+        <w:t>Part 1：命题前置分析与洞察（177 字）</w:t>
       </w:r>
     </w:p>
     <w:p>
@@ -52,7 +52,7 @@
         <w:rPr>
           <w:rFonts w:ascii="Calibri" w:hAnsi="Calibri" w:eastAsia="Microsoft YaHei"/>
         </w:rPr>
-        <w:t>补充要求说明，云图合成氨装置在硬件层面的单位成本已接近理论最优，下一轮降本空间来自合成氨运行管理的软件层。命题真正考察的是能否打造“合成氨超级数字员工”：围绕氨合成负荷、氢氮比、合成塔床层温升、循环压缩机、液氨库存和下游用氨，实时挖掘成本偏差，缩短调度指挥链条，沉淀专家知识并自我迭代。云图控股应城 70 万吨合成氨项目补齐氮肥原料，与尿浆、复合肥、联碱和液氨外售形成协同链路[3][4][5]。因此，AI 调度专家不应只是聊天机器人或看板，而应在不触碰 DCS/SIS 安全控制底线的前提下，融合 MES、ERP、DCS historian、罐区和设备点检数据，形成“寻优-指挥-监督-学习”闭环。</w:t>
+        <w:t>这道题的核心不是再造一个看板，而是在合成氨硬件成本已接近极限后，用AI挖掘运行管理的软件降本空间。云图应城合成氨装置连接尿浆、复合肥、联碱和液氨外售，调度同时受氢氮比、合成塔温升、循环压缩机、液氨库存、下游订单和能耗约束。企业想看到的能力，是把行业资料、现场机理、专家经验和实时数据合成一个会寻优、会指挥、会复盘、会学习的数字调度员，而不是泛泛讲大模型。</w:t>
       </w:r>
     </w:p>
     <w:p>
@@ -60,7 +60,7 @@
         <w:pStyle w:val="Heading2"/>
       </w:pPr>
       <w:r>
-        <w:t>Part 2：整体解决方案设计（约 560 字）</w:t>
+        <w:t>Part 2：整体解决方案设计（386 字）</w:t>
       </w:r>
     </w:p>
     <w:p>
@@ -68,7 +68,15 @@
         <w:rPr>
           <w:rFonts w:ascii="Calibri" w:hAnsi="Calibri" w:eastAsia="Microsoft YaHei"/>
         </w:rPr>
-        <w:t>方案命名为“合成氨 AI 调控师工作台”。第一阶段不自动控制装置，而是做影子运行、班前会辅助和班后复盘。平台先接入 MES 日计划、ERP 订单与交期、液氨罐区库存、DCS 关键摘要点、设备健康评分和原料/蒸汽电价窗口，形成班次事实表。预测层滚动预测下游用氨、液氨库存消耗、吨氨能源成本和设备风险；约束层用机理边界和专家规则校验氢氮比、合成塔床层温升、循环压缩机负荷、罐区压力、安全库存、负荷升降速率和环保指标；寻优层设置吨氨成本雷达，拆解原料/蒸汽、液氨库存、压缩机效率、合成塔窗口和负荷偏差五类可挖潜因子；优化层生成稳氨、保供、护机三套方案，分别说明合成负荷、下游消纳、库存策略、点检窗口和收益风险；指挥层一键生成交接摘要和调度指令，执行监督层自动跟踪合成负荷偏差、氢氮比偏差、液氨库存变化和订单完成。</w:t>
+        <w:t>我设计“合成氨AI调控师工作台”，先以影子运行接入MES日计划、ERP订单交期、DCS关键点位、液氨罐区、设备点检和能源价格，形成班次事实表。系统用预测模型滚动判断下游用氨、库存水位、吨氨能耗和设备风险；用机理约束校验氢氮比、合成塔床层温升、循环压缩机负荷、罐区压力、安全库存和负荷升降速率；再由优化器生成稳氨、保供、护机三案，给出推荐负荷、下游分配、成本收益、风险边界和需人工确认事项。调度员采纳后，平台跟踪实际负荷、氢氮比偏差、液氨库存变化、订单完成和吨氨成本，自动生成班后复盘。每次采纳或未采纳原因都会进入合成负荷指令库、异常经验库和专家规则库，用于周度校准。落地按30/60/90天推进：先打通数据口径，再影子对比人工调度，最后小闭环验收。价值以高优订单满足率、单位氨能耗、库存占用、调度耗时和异常预警提前量量化；低置信、数据延迟或安环红线接近时自动降级人工调度。</w:t>
+      </w:r>
+    </w:p>
+    <w:p>
+      <w:pPr>
+        <w:pStyle w:val="Heading1"/>
+      </w:pPr>
+      <w:r>
+        <w:t>补充展开：为什么这样答更贴合企业</w:t>
       </w:r>
     </w:p>
     <w:p>
@@ -76,7 +84,15 @@
         <w:rPr>
           <w:rFonts w:ascii="Calibri" w:hAnsi="Calibri" w:eastAsia="Microsoft YaHei"/>
         </w:rPr>
-        <w:t>每次方案会沉淀为合成氨知识库：输入状态、推荐合成负荷、氢氮比/床层温升约束、审批人、采纳/未采纳原因、实际执行偏差和效果归因。落地路线采用 30/60/90 天试点：30 天跑通数据事实表和口径确认，60 天进入影子模式记录采纳/不采纳原因，90 天做小闭环复盘并决定是否扩大范围。验收采用保守口径：高优下游用氨满足率不低于人工排产，且吨氨能耗、液氨库存占用、调度耗时或异常预警至少一项稳定改善；若关键数据延迟超过 15 分钟、模型连续两天偏差超阈值或安环红线接近且无法解释，系统自动降级为人工调度。该方案的创新点不是“让 AI 接管生产”，而是把合成氨连续流程装置的现场经验、优化模型和企业经营目标整合成可审计、可复盘、可逐步自我升级的数字员工。</w:t>
+        <w:t>截图要求强调“跳出基础信息、搜集行业报告、竞品案例、用户真实反馈并输出理解与思考”。因此开题报告不能写成技术综述，而要先把试题的产业语境讲清楚：云图的合成氨不只是单套装置稳产，而是连接尿浆、复合肥、联碱、液氨外售和氮肥自给率的经营枢纽。</w:t>
+      </w:r>
+    </w:p>
+    <w:p>
+      <w:r>
+        <w:rPr>
+          <w:rFonts w:ascii="Calibri" w:hAnsi="Calibri" w:eastAsia="Microsoft YaHei"/>
+        </w:rPr>
+        <w:t>整体方案也不能只写算法名词。评委真正会关注五件事：架构是否完整、创新是否区别于普通看板、业务价值是否可量化、试点是否能落地、未来是否可推广。因此本方案采用“影子运行先行、人机确认闭环、DCS/SIS 守底线、采纳效果进知识库”的路径，把 AI 定位为合成氨调度员的专业副驾驶。</w:t>
       </w:r>
     </w:p>
     <w:p>

</xml_diff>